<commit_message>
Approve Sylvia, Lizz, Sam, Katrina SOPs — un-pause Lizz + Sam
SOP status: 4/17 approved, 13 pending
- Sylvia Van Hoeven: approved (Cara Best, CC >$1,500)
- Lizz Freixas: approved + un-paused (Chenni Li, CC >$600)
- Sam Jones: approved + un-paused (Cara Best, CC >$900)
- Katrina Moore: approved (Chenni Li, CC >$600)

All 13 remaining talents stay pending — AI returns Human Admin
Required for them until their SOP is submitted and approved.

Co-Authored-By: Claude Sonnet 4.6 <noreply@anthropic.com>
</commit_message>
<xml_diff>
--- a/sheets/sop.docx
+++ b/sheets/sop.docx
@@ -27,7 +27,7 @@
         <w:t xml:space="preserve">✅ APPROVED (AI may draft): </w:t>
       </w:r>
       <w:r>
-        <w:t>Sylvia Van Hoeven</w:t>
+        <w:t>Sylvia Van Hoeven, Sam Jones, Lizz Freixas, Katrina Moore</w:t>
       </w:r>
     </w:p>
     <w:p>
@@ -38,7 +38,7 @@
         <w:t xml:space="preserve">⏳ PENDING (AI will NOT draft — Human Admin Required): </w:t>
       </w:r>
       <w:r>
-        <w:t>Trinity Blair, Sam Jones, Brittanie Hammer, Allee Baray, Lizz Freixas, Katrina, Jenn Lyles, Angela Callisto, Colleen Fusco, Alana Calviello, Grayson Finks, Kylika Miller, Anastasiya, Katrina D, Michaela, Skyler Clark</w:t>
+        <w:t>Trinity Blair, Brittanie Hammer, Allee Baray, Jenn Lyles, Angela Callisto, Colleen Fusco, Alana Calviello, Grayson Finks, Kylika Miller, Anastasiya, Katrina D, Michaela, Skyler Clark</w:t>
       </w:r>
     </w:p>
     <w:p>
@@ -448,17 +448,221 @@
         <w:rPr>
           <w:b/>
         </w:rPr>
-        <w:t>⏳ SOP PENDING — AI will NOT draft. All emails routed to Human Admin Required.</w:t>
+        <w:t>✅ SOP APPROVED — AI may draft for this talent</w:t>
       </w:r>
     </w:p>
     <w:p>
       <w:r>
-        <w:t>Manager: Cara  |  Minimum Rate: $700 per video</w:t>
+        <w:t>Manager: Cara Best (cara@taboost.me)  |  Minimum Rate: $700 per video</w:t>
+      </w:r>
+    </w:p>
+    <w:p>
+      <w:pPr>
+        <w:pStyle w:val="Heading2"/>
+      </w:pPr>
+      <w:r>
+        <w:t>Scenario A: Initial Inbound (Default Response) — DEFAULT RESPONSE</w:t>
       </w:r>
     </w:p>
     <w:p>
       <w:r>
-        <w:t>(Add approved scenarios below when ready.)</w:t>
+        <w:rPr>
+          <w:b/>
+        </w:rPr>
+        <w:t>Use when:</w:t>
+      </w:r>
+    </w:p>
+    <w:p>
+      <w:r>
+        <w:t>• Asking for rates or a potential to collab</w:t>
+      </w:r>
+    </w:p>
+    <w:p>
+      <w:r>
+        <w:t>• All other general inquiries</w:t>
+      </w:r>
+    </w:p>
+    <w:p>
+      <w:r>
+        <w:rPr>
+          <w:b/>
+        </w:rPr>
+        <w:t>Do not use when:</w:t>
+      </w:r>
+    </w:p>
+    <w:p>
+      <w:r>
+        <w:t>• An exact match from a more specific scenario below</w:t>
+      </w:r>
+    </w:p>
+    <w:p>
+      <w:r>
+        <w:rPr>
+          <w:b/>
+        </w:rPr>
+        <w:t>Approved Response:</w:t>
+      </w:r>
+    </w:p>
+    <w:p>
+      <w:r>
+        <w:t>Thank you so much for reaching out about a potential partnership with Sam!! I'm happy to share her rates below:</w:t>
+      </w:r>
+    </w:p>
+    <w:p>
+      <w:r>
+        <w:t>• 1 TikTok: $900</w:t>
+      </w:r>
+    </w:p>
+    <w:p>
+      <w:r>
+        <w:t>• 1 IG Reel: $600</w:t>
+      </w:r>
+    </w:p>
+    <w:p>
+      <w:r>
+        <w:t>• 1 UGC Video: $1,500 (usage can be added on for an additional cost)</w:t>
+      </w:r>
+    </w:p>
+    <w:p/>
+    <w:p>
+      <w:r>
+        <w:t>Sam's pricing reflects her high-quality, conversion-focused content and consistent performance for brands. Last month on TikTok Shop her GMV was over $150k!</w:t>
+      </w:r>
+    </w:p>
+    <w:p/>
+    <w:p>
+      <w:r>
+        <w:t>Please let us know what type of collab you're looking for in your offer + if you have any questions moving forward. We'd love to explore working together!</w:t>
+      </w:r>
+    </w:p>
+    <w:p>
+      <w:pPr>
+        <w:pStyle w:val="Heading2"/>
+      </w:pPr>
+      <w:r>
+        <w:t>Scenario B: Initial Inbound (Bundle Rate Requested)</w:t>
+      </w:r>
+    </w:p>
+    <w:p>
+      <w:r>
+        <w:rPr>
+          <w:b/>
+        </w:rPr>
+        <w:t>Use when:</w:t>
+      </w:r>
+    </w:p>
+    <w:p>
+      <w:r>
+        <w:t>• Asking for bundle rates</w:t>
+      </w:r>
+    </w:p>
+    <w:p>
+      <w:r>
+        <w:rPr>
+          <w:b/>
+        </w:rPr>
+        <w:t>Do not use when:</w:t>
+      </w:r>
+    </w:p>
+    <w:p>
+      <w:r>
+        <w:t>• Multiple post rate is not asked for</w:t>
+      </w:r>
+    </w:p>
+    <w:p>
+      <w:r>
+        <w:rPr>
+          <w:b/>
+        </w:rPr>
+        <w:t>Approved Response:</w:t>
+      </w:r>
+    </w:p>
+    <w:p>
+      <w:r>
+        <w:t>Her standard rate is $900 per video! Below is her bundle pricing:</w:t>
+      </w:r>
+    </w:p>
+    <w:p/>
+    <w:p>
+      <w:r>
+        <w:t>3 videos (90%) → $2,400</w:t>
+      </w:r>
+    </w:p>
+    <w:p>
+      <w:r>
+        <w:t>5 videos (85%) → $3,800</w:t>
+      </w:r>
+    </w:p>
+    <w:p>
+      <w:r>
+        <w:t>10 videos (75%) → $6,750</w:t>
+      </w:r>
+    </w:p>
+    <w:p/>
+    <w:p>
+      <w:r>
+        <w:t>We've found bundles usually perform better since multiple posts make the product feel like a real part of her routine instead of a one-off. Let me know your thoughts!</w:t>
+      </w:r>
+    </w:p>
+    <w:p>
+      <w:pPr>
+        <w:pStyle w:val="Heading2"/>
+      </w:pPr>
+      <w:r>
+        <w:t>Scenario C: Initial Inbound (Adequate Offer)</w:t>
+      </w:r>
+    </w:p>
+    <w:p>
+      <w:r>
+        <w:rPr>
+          <w:b/>
+        </w:rPr>
+        <w:t>Use when:</w:t>
+      </w:r>
+    </w:p>
+    <w:p>
+      <w:r>
+        <w:t>• Initially offered a rate that is OVER $900 for one post</w:t>
+      </w:r>
+    </w:p>
+    <w:p>
+      <w:r>
+        <w:rPr>
+          <w:b/>
+        </w:rPr>
+        <w:t>Do not use when:</w:t>
+      </w:r>
+    </w:p>
+    <w:p>
+      <w:r>
+        <w:t>• An explicit offer of the above rate is not specified</w:t>
+      </w:r>
+    </w:p>
+    <w:p>
+      <w:r>
+        <w:rPr>
+          <w:b/>
+        </w:rPr>
+        <w:t>CC: cara@taboost.me</w:t>
+      </w:r>
+    </w:p>
+    <w:p>
+      <w:r>
+        <w:rPr>
+          <w:b/>
+        </w:rPr>
+        <w:t>Approved Response:</w:t>
+      </w:r>
+    </w:p>
+    <w:p>
+      <w:r>
+        <w:t>Hi,</w:t>
+      </w:r>
+    </w:p>
+    <w:p/>
+    <w:p>
+      <w:r>
+        <w:t>Thank you for the offer! I think this collab could be a good fit for Sam. Looping her in management team who can move forward with this convo!</w:t>
       </w:r>
     </w:p>
     <w:p>
@@ -526,17 +730,216 @@
         <w:rPr>
           <w:b/>
         </w:rPr>
-        <w:t>⏳ SOP PENDING — AI will NOT draft. All emails routed to Human Admin Required.</w:t>
+        <w:t>✅ SOP APPROVED — AI may draft for this talent</w:t>
       </w:r>
     </w:p>
     <w:p>
       <w:r>
-        <w:t>Manager: Chenni  |  Minimum Rate: $600 per video</w:t>
+        <w:t>Manager: Chenni Li (chenni@taboost.me)  |  Minimum Rate: $600 per video</w:t>
+      </w:r>
+    </w:p>
+    <w:p>
+      <w:pPr>
+        <w:pStyle w:val="Heading2"/>
+      </w:pPr>
+      <w:r>
+        <w:t>Scenario A: Initial Inbound (Default Response) — DEFAULT RESPONSE</w:t>
       </w:r>
     </w:p>
     <w:p>
       <w:r>
-        <w:t>(Add approved scenarios below when ready.)</w:t>
+        <w:rPr>
+          <w:b/>
+        </w:rPr>
+        <w:t>Use when:</w:t>
+      </w:r>
+    </w:p>
+    <w:p>
+      <w:r>
+        <w:t>• Asking for rates or a potential to collab</w:t>
+      </w:r>
+    </w:p>
+    <w:p>
+      <w:r>
+        <w:t>• All other general inquiries</w:t>
+      </w:r>
+    </w:p>
+    <w:p>
+      <w:r>
+        <w:rPr>
+          <w:b/>
+        </w:rPr>
+        <w:t>Do not use when:</w:t>
+      </w:r>
+    </w:p>
+    <w:p>
+      <w:r>
+        <w:t>• An exact match from a more specific scenario below</w:t>
+      </w:r>
+    </w:p>
+    <w:p>
+      <w:r>
+        <w:rPr>
+          <w:b/>
+        </w:rPr>
+        <w:t>Approved Response:</w:t>
+      </w:r>
+    </w:p>
+    <w:p>
+      <w:r>
+        <w:t>Thank you so much for reaching out about a potential partnership with Lizz!! I'm happy to share her rates below:</w:t>
+      </w:r>
+    </w:p>
+    <w:p>
+      <w:r>
+        <w:t>• 1 TikTok: $750</w:t>
+      </w:r>
+    </w:p>
+    <w:p>
+      <w:r>
+        <w:t>• 1 UGC Video: $900 (usage to be negotiated)</w:t>
+      </w:r>
+    </w:p>
+    <w:p/>
+    <w:p>
+      <w:r>
+        <w:t>Lizz's pricing reflects her extremely high conversion rate from content that truly sells. Her monthly GMV is $550k+ and she is an expert at directing her loyal followers/buyers to the right fashion products. Lizz's engagement rate is also super high for a shop creator which is ideal for brand collabs.</w:t>
+      </w:r>
+    </w:p>
+    <w:p/>
+    <w:p>
+      <w:r>
+        <w:t>Please let us know what type of collab you're looking for in your offer + if you have any questions moving forward. We'd love to explore working together!</w:t>
+      </w:r>
+    </w:p>
+    <w:p>
+      <w:pPr>
+        <w:pStyle w:val="Heading2"/>
+      </w:pPr>
+      <w:r>
+        <w:t>Scenario B: Initial Inbound (Bundle Rate Requested)</w:t>
+      </w:r>
+    </w:p>
+    <w:p>
+      <w:r>
+        <w:rPr>
+          <w:b/>
+        </w:rPr>
+        <w:t>Use when:</w:t>
+      </w:r>
+    </w:p>
+    <w:p>
+      <w:r>
+        <w:t>• Asking for bundle rates</w:t>
+      </w:r>
+    </w:p>
+    <w:p>
+      <w:r>
+        <w:rPr>
+          <w:b/>
+        </w:rPr>
+        <w:t>Do not use when:</w:t>
+      </w:r>
+    </w:p>
+    <w:p>
+      <w:r>
+        <w:t>• Multiple post rate is not asked for</w:t>
+      </w:r>
+    </w:p>
+    <w:p>
+      <w:r>
+        <w:rPr>
+          <w:b/>
+        </w:rPr>
+        <w:t>Approved Response:</w:t>
+      </w:r>
+    </w:p>
+    <w:p>
+      <w:r>
+        <w:t>Lizz's standard rate is $750 per video! Below is her bundle pricing:</w:t>
+      </w:r>
+    </w:p>
+    <w:p/>
+    <w:p>
+      <w:r>
+        <w:t>3 videos (90%) → $2,000</w:t>
+      </w:r>
+    </w:p>
+    <w:p>
+      <w:r>
+        <w:t>5 videos (85%) → $3,100</w:t>
+      </w:r>
+    </w:p>
+    <w:p>
+      <w:r>
+        <w:t>10 videos (75%) → $5,600</w:t>
+      </w:r>
+    </w:p>
+    <w:p/>
+    <w:p>
+      <w:r>
+        <w:t>We've found bundles usually perform better since multiple posts make the product feel like a real part of her routine instead of a one-off. Let me know your thoughts!</w:t>
+      </w:r>
+    </w:p>
+    <w:p>
+      <w:pPr>
+        <w:pStyle w:val="Heading2"/>
+      </w:pPr>
+      <w:r>
+        <w:t>Scenario C: Initial Inbound (Adequate Offer)</w:t>
+      </w:r>
+    </w:p>
+    <w:p>
+      <w:r>
+        <w:rPr>
+          <w:b/>
+        </w:rPr>
+        <w:t>Use when:</w:t>
+      </w:r>
+    </w:p>
+    <w:p>
+      <w:r>
+        <w:t>• Initially offered a rate that is OVER $600 for one post</w:t>
+      </w:r>
+    </w:p>
+    <w:p>
+      <w:r>
+        <w:rPr>
+          <w:b/>
+        </w:rPr>
+        <w:t>Do not use when:</w:t>
+      </w:r>
+    </w:p>
+    <w:p>
+      <w:r>
+        <w:t>• An explicit offer of the above rate is not specified</w:t>
+      </w:r>
+    </w:p>
+    <w:p>
+      <w:r>
+        <w:rPr>
+          <w:b/>
+        </w:rPr>
+        <w:t>CC: chenni@taboost.me</w:t>
+      </w:r>
+    </w:p>
+    <w:p>
+      <w:r>
+        <w:rPr>
+          <w:b/>
+        </w:rPr>
+        <w:t>Approved Response:</w:t>
+      </w:r>
+    </w:p>
+    <w:p>
+      <w:r>
+        <w:t>Hi,</w:t>
+      </w:r>
+    </w:p>
+    <w:p/>
+    <w:p>
+      <w:r>
+        <w:t>Thank you for the offer! I think this collab could be a good fit for Lizz. Looping her in management team who can move forward with this convo!</w:t>
       </w:r>
     </w:p>
     <w:p>
@@ -544,7 +947,7 @@
         <w:pStyle w:val="Heading1"/>
       </w:pPr>
       <w:r>
-        <w:t>KATRINA</w:t>
+        <w:t>KATRINA MOORE</w:t>
       </w:r>
     </w:p>
     <w:p>
@@ -552,17 +955,221 @@
         <w:rPr>
           <w:b/>
         </w:rPr>
-        <w:t>⏳ SOP PENDING — AI will NOT draft. All emails routed to Human Admin Required.</w:t>
+        <w:t>✅ SOP APPROVED — AI may draft for this talent</w:t>
       </w:r>
     </w:p>
     <w:p>
       <w:r>
-        <w:t>Manager: Chenni  |  Minimum Rate: $300 per video</w:t>
+        <w:t>Manager: Chenni Li (chenni@taboost.me)  |  Minimum Rate: $300 per video</w:t>
+      </w:r>
+    </w:p>
+    <w:p>
+      <w:pPr>
+        <w:pStyle w:val="Heading2"/>
+      </w:pPr>
+      <w:r>
+        <w:t>Scenario A: Initial Inbound (Default Response) — DEFAULT RESPONSE</w:t>
       </w:r>
     </w:p>
     <w:p>
       <w:r>
-        <w:t>(Add approved scenarios below when ready.)</w:t>
+        <w:rPr>
+          <w:b/>
+        </w:rPr>
+        <w:t>Use when:</w:t>
+      </w:r>
+    </w:p>
+    <w:p>
+      <w:r>
+        <w:t>• Asking for rates or a potential to collab</w:t>
+      </w:r>
+    </w:p>
+    <w:p>
+      <w:r>
+        <w:t>• All other general inquiries</w:t>
+      </w:r>
+    </w:p>
+    <w:p>
+      <w:r>
+        <w:rPr>
+          <w:b/>
+        </w:rPr>
+        <w:t>Do not use when:</w:t>
+      </w:r>
+    </w:p>
+    <w:p>
+      <w:r>
+        <w:t>• An exact match from a more specific scenario below</w:t>
+      </w:r>
+    </w:p>
+    <w:p>
+      <w:r>
+        <w:rPr>
+          <w:b/>
+        </w:rPr>
+        <w:t>Approved Response:</w:t>
+      </w:r>
+    </w:p>
+    <w:p>
+      <w:r>
+        <w:t>Thank you so much for reaching out about a potential partnership with Katrina!! I'm happy to share her rates below:</w:t>
+      </w:r>
+    </w:p>
+    <w:p>
+      <w:r>
+        <w:t>• 1 TikTok: $500</w:t>
+      </w:r>
+    </w:p>
+    <w:p>
+      <w:r>
+        <w:t>• Cross posting to IG Reels: + $150</w:t>
+      </w:r>
+    </w:p>
+    <w:p>
+      <w:r>
+        <w:t>• 1 UGC Video: $400 (usage to be negotiated)</w:t>
+      </w:r>
+    </w:p>
+    <w:p/>
+    <w:p>
+      <w:r>
+        <w:t>Katrina's pricing reflects her extremely high conversion rate. Her monthly GMV is $450k+ and she is an expert at directing her loyal followers/buyers to the right fashion products. Katrina has a strong following plus great engagement!!!.</w:t>
+      </w:r>
+    </w:p>
+    <w:p/>
+    <w:p>
+      <w:r>
+        <w:t>Please let us know what type of collab you're looking for in your offer + if you have any questions moving forward. We'd love to explore working together!</w:t>
+      </w:r>
+    </w:p>
+    <w:p>
+      <w:pPr>
+        <w:pStyle w:val="Heading2"/>
+      </w:pPr>
+      <w:r>
+        <w:t>Scenario B: Initial Inbound (Bundle Rate Requested)</w:t>
+      </w:r>
+    </w:p>
+    <w:p>
+      <w:r>
+        <w:rPr>
+          <w:b/>
+        </w:rPr>
+        <w:t>Use when:</w:t>
+      </w:r>
+    </w:p>
+    <w:p>
+      <w:r>
+        <w:t>• Asking for bundle rates</w:t>
+      </w:r>
+    </w:p>
+    <w:p>
+      <w:r>
+        <w:rPr>
+          <w:b/>
+        </w:rPr>
+        <w:t>Do not use when:</w:t>
+      </w:r>
+    </w:p>
+    <w:p>
+      <w:r>
+        <w:t>• Multiple post rate is not asked for</w:t>
+      </w:r>
+    </w:p>
+    <w:p>
+      <w:r>
+        <w:rPr>
+          <w:b/>
+        </w:rPr>
+        <w:t>Approved Response:</w:t>
+      </w:r>
+    </w:p>
+    <w:p>
+      <w:r>
+        <w:t>Katrina's standard rate is $500 per video! Below is her bundle pricing:</w:t>
+      </w:r>
+    </w:p>
+    <w:p/>
+    <w:p>
+      <w:r>
+        <w:t>3 videos (90%) → $1,350</w:t>
+      </w:r>
+    </w:p>
+    <w:p>
+      <w:r>
+        <w:t>5 videos (85%) → $2,100</w:t>
+      </w:r>
+    </w:p>
+    <w:p>
+      <w:r>
+        <w:t>10 videos (75%) → $3,750</w:t>
+      </w:r>
+    </w:p>
+    <w:p/>
+    <w:p>
+      <w:r>
+        <w:t>We've found bundles usually perform better since multiple posts make the product feel like a real part of her routine instead of a one-off. Let me know your thoughts!</w:t>
+      </w:r>
+    </w:p>
+    <w:p>
+      <w:pPr>
+        <w:pStyle w:val="Heading2"/>
+      </w:pPr>
+      <w:r>
+        <w:t>Scenario C: Initial Inbound (Adequate Offer)</w:t>
+      </w:r>
+    </w:p>
+    <w:p>
+      <w:r>
+        <w:rPr>
+          <w:b/>
+        </w:rPr>
+        <w:t>Use when:</w:t>
+      </w:r>
+    </w:p>
+    <w:p>
+      <w:r>
+        <w:t>• Initially offered a rate that is OVER $600 for one post</w:t>
+      </w:r>
+    </w:p>
+    <w:p>
+      <w:r>
+        <w:rPr>
+          <w:b/>
+        </w:rPr>
+        <w:t>Do not use when:</w:t>
+      </w:r>
+    </w:p>
+    <w:p>
+      <w:r>
+        <w:t>• An explicit offer of the above rate is not specified</w:t>
+      </w:r>
+    </w:p>
+    <w:p>
+      <w:r>
+        <w:rPr>
+          <w:b/>
+        </w:rPr>
+        <w:t>CC: chenni@taboost.me</w:t>
+      </w:r>
+    </w:p>
+    <w:p>
+      <w:r>
+        <w:rPr>
+          <w:b/>
+        </w:rPr>
+        <w:t>Approved Response:</w:t>
+      </w:r>
+    </w:p>
+    <w:p>
+      <w:r>
+        <w:t>Hi,</w:t>
+      </w:r>
+    </w:p>
+    <w:p/>
+    <w:p>
+      <w:r>
+        <w:t>Thank you for the offer! I think this collab could be a good fit for Katrina. Looping her in management team who can move forward with this convo!</w:t>
       </w:r>
     </w:p>
     <w:p>

</xml_diff>

<commit_message>
Remove KatrinaD; un-pause Britt; activate all connected inboxes
- KatrinaD removed from settings.json and sop_data.json
- Britt un-paused — inbox will now poll (SOP pending, routes to Human Admin Required until SOP approved)
- Sam and Lizz already un-paused in previous commit
- Colin test account stays inactive (paused)
- Skyler stays paused (not connected yet)

Active inboxes: Sylvia, Trin, Sam, Britt, Allee, Lizz, Katrina,
Jenn, Angela, Colleen, Alana, Grayson, Kylika, Anastasiya, Skyler (pending connect)

Co-Authored-By: Claude Sonnet 4.6 <noreply@anthropic.com>
</commit_message>
<xml_diff>
--- a/sheets/sop.docx
+++ b/sheets/sop.docx
@@ -38,7 +38,7 @@
         <w:t xml:space="preserve">⏳ PENDING (AI will NOT draft — Human Admin Required): </w:t>
       </w:r>
       <w:r>
-        <w:t>Trinity Blair, Brittanie Hammer, Allee Baray, Jenn Lyles, Angela Callisto, Colleen Fusco, Alana Calviello, Grayson Finks, Kylika Miller, Anastasiya, Katrina D, Michaela, Skyler Clark</w:t>
+        <w:t>Trinity Blair, Brittanie Hammer, Allee Baray, Jenn Lyles, Angela Callisto, Colleen Fusco, Alana Calviello, Grayson Finks, Kylika Miller, Anastasiya, Michaela, Skyler Clark</w:t>
       </w:r>
     </w:p>
     <w:p>
@@ -1359,32 +1359,6 @@
         <w:pStyle w:val="Heading1"/>
       </w:pPr>
       <w:r>
-        <w:t>KATRINA D</w:t>
-      </w:r>
-    </w:p>
-    <w:p>
-      <w:r>
-        <w:rPr>
-          <w:b/>
-        </w:rPr>
-        <w:t>⏳ SOP PENDING — AI will NOT draft. All emails routed to Human Admin Required.</w:t>
-      </w:r>
-    </w:p>
-    <w:p>
-      <w:r>
-        <w:t>Manager: Cara  |  Minimum Rate: $150 per hour</w:t>
-      </w:r>
-    </w:p>
-    <w:p>
-      <w:r>
-        <w:t>(Add approved scenarios below when ready.)</w:t>
-      </w:r>
-    </w:p>
-    <w:p>
-      <w:pPr>
-        <w:pStyle w:val="Heading1"/>
-      </w:pPr>
-      <w:r>
         <w:t>MICHAELA</w:t>
       </w:r>
     </w:p>

</xml_diff>

<commit_message>
Remove Colin test account; add Wesley Barker; fix Anastasiya Ray
- colineyre222 removed from settings.json and sop_data.json
- Wesley Barker added (paused, SOP pending, needs Gmail connect)
- Anastasiya full_name updated to 'Anastasiya Ray' in both files

Co-Authored-By: Claude Sonnet 4.6 <noreply@anthropic.com>
</commit_message>
<xml_diff>
--- a/sheets/sop.docx
+++ b/sheets/sop.docx
@@ -38,7 +38,7 @@
         <w:t xml:space="preserve">⏳ PENDING (AI will NOT draft — Human Admin Required): </w:t>
       </w:r>
       <w:r>
-        <w:t>Trinity Blair, Brittanie Hammer, Allee Baray, Jenn Lyles, Angela Callisto, Colleen Fusco, Alana Calviello, Grayson Finks, Kylika Miller, Anastasiya, Michaela, Skyler Clark</w:t>
+        <w:t>Trinity Blair, Brittanie Hammer, Allee Baray, Jenn Lyles, Angela Callisto, Colleen Fusco, Alana Calviello, Grayson Finks, Kylika Miller, Anastasiya Ray, Michaela, Skyler Clark, Wesley Barker</w:t>
       </w:r>
     </w:p>
     <w:p>
@@ -1333,7 +1333,7 @@
         <w:pStyle w:val="Heading1"/>
       </w:pPr>
       <w:r>
-        <w:t>ANASTASIYA</w:t>
+        <w:t>ANASTASIYA RAY</w:t>
       </w:r>
     </w:p>
     <w:p>
@@ -1386,6 +1386,32 @@
       </w:pPr>
       <w:r>
         <w:t>SKYLER CLARK</w:t>
+      </w:r>
+    </w:p>
+    <w:p>
+      <w:r>
+        <w:rPr>
+          <w:b/>
+        </w:rPr>
+        <w:t>⏳ SOP PENDING — AI will NOT draft. All emails routed to Human Admin Required.</w:t>
+      </w:r>
+    </w:p>
+    <w:p>
+      <w:r>
+        <w:t>Manager:   |  Minimum Rate: $0 per video</w:t>
+      </w:r>
+    </w:p>
+    <w:p>
+      <w:r>
+        <w:t>(Add approved scenarios below when ready.)</w:t>
+      </w:r>
+    </w:p>
+    <w:p>
+      <w:pPr>
+        <w:pStyle w:val="Heading1"/>
+      </w:pPr>
+      <w:r>
+        <w:t>WESLEY BARKER</w:t>
       </w:r>
     </w:p>
     <w:p>

</xml_diff>

<commit_message>
Sylvia media kit link — replace HERE placeholder with real URL
https://taboost.my.canva.site/sylvia now appears in Scenario A and B drafts.

Co-Authored-By: Claude Sonnet 4.6 <noreply@anthropic.com>
</commit_message>
<xml_diff>
--- a/sheets/sop.docx
+++ b/sheets/sop.docx
@@ -244,7 +244,7 @@
     </w:p>
     <w:p>
       <w:r>
-        <w:t>Thank you so much for reaching out about a potential partnership with Sylvia!! I'm happy to share her media kit HERE + rates below:</w:t>
+        <w:t>Thank you so much for reaching out about a potential partnership with Sylvia!! I'm happy to share her media kit https://taboost.my.canva.site/sylvia + rates below:</w:t>
       </w:r>
     </w:p>
     <w:p>
@@ -323,7 +323,7 @@
     </w:p>
     <w:p>
       <w:r>
-        <w:t>Sylvia's standard rate is $2,000 per video! HERE is her media kit. Below is her bundle pricing:</w:t>
+        <w:t>Sylvia's standard rate is $2,000 per video! https://taboost.my.canva.site/sylvia is her media kit. Below is her bundle pricing:</w:t>
       </w:r>
     </w:p>
     <w:p/>

</xml_diff>

<commit_message>
Update SOP rules and add internal hyperlink rendering support
Agent-Logs-Url: https://github.com/ceyre-boop/email-automation/sessions/e03ac503-e657-4d4b-8158-1ac0dfcb427e

Co-authored-by: ceyre-boop <256899132+ceyre-boop@users.noreply.github.com>
</commit_message>
<xml_diff>
--- a/sheets/sop.docx
+++ b/sheets/sop.docx
@@ -27,7 +27,7 @@
         <w:t xml:space="preserve">✅ APPROVED (AI may draft): </w:t>
       </w:r>
       <w:r>
-        <w:t>Sylvia Van Hoeven, Sam Jones, Lizz Freixas, Katrina Moore</w:t>
+        <w:t>Sylvia Van Hoeven, Trinity Blair, Sam Jones, Lizz Freixas, Katrina Moore</w:t>
       </w:r>
     </w:p>
     <w:p>
@@ -38,7 +38,7 @@
         <w:t xml:space="preserve">⏳ PENDING (AI will NOT draft — Human Admin Required): </w:t>
       </w:r>
       <w:r>
-        <w:t>Trinity Blair, Brittanie Hammer, Allee Baray, Jenn Lyles, Angela Callisto, Colleen Fusco, Alana Calviello, Grayson Finks, Kylika Miller, Anastasiya Ray, Michaela, Skyler Clark, Wesley Barker</w:t>
+        <w:t>Brittanie Hammer, Allee Baray, Jenn Lyles, Angela Callisto, Colleen Fusco, Alana Calviello, Grayson Finks, Kylika Miller, Anastasiya Ray, Michaela, Skyler Clark, Wesley Barker</w:t>
       </w:r>
     </w:p>
     <w:p>
@@ -81,12 +81,17 @@
     </w:p>
     <w:p>
       <w:r>
-        <w:t>7. Output must clearly state the action taken: Approved Response / Human Admin Required / Spam / Ignore.</w:t>
+        <w:t>7. Output must clearly state the action taken: Approved Response / Human Admin Required / Spam/Trash.</w:t>
       </w:r>
     </w:p>
     <w:p>
       <w:r>
         <w:t>8. If using an approved response: return the exact approved response only. Do not modify the response text. Do not combine multiple approved responses. Do not add extra commentary inside the email draft.</w:t>
+      </w:r>
+    </w:p>
+    <w:p>
+      <w:r>
+        <w:t>9. Approved hyperlinks preserved + rendering behavior. The format Anchor Text [URL] is an internal formatting instruction, not final output text. In drafted emails, render only the Anchor Text visibly, attach the URL as hyperlink destination, and do not display the bracketed URL in visible email copy.</w:t>
       </w:r>
     </w:p>
     <w:p>
@@ -124,21 +129,10 @@
         <w:rPr>
           <w:b/>
         </w:rPr>
-        <w:t xml:space="preserve">Spam: </w:t>
+        <w:t xml:space="preserve">Spam/Trash: </w:t>
       </w:r>
       <w:r>
         <w:t>Emails that are clearly junk: phishing, scams, unrelated service pitches, fake prizes, malware. Conservative threshold — when in doubt, do not classify as Spam.</w:t>
-      </w:r>
-    </w:p>
-    <w:p>
-      <w:r>
-        <w:rPr>
-          <w:b/>
-        </w:rPr>
-        <w:t xml:space="preserve">Ignore: </w:t>
-      </w:r>
-      <w:r>
-        <w:t>Emails that are not real brand deals, are fan mail, or require no response. Trinity receives fan mail which is classified as Ignore.</w:t>
       </w:r>
     </w:p>
     <w:p>
@@ -231,7 +225,7 @@
     </w:p>
     <w:p>
       <w:r>
-        <w:t>• An exact match from a more specific scenario below</w:t>
+        <w:t>• An exact match from scenario below</w:t>
       </w:r>
     </w:p>
     <w:p>
@@ -244,22 +238,22 @@
     </w:p>
     <w:p>
       <w:r>
-        <w:t>Thank you so much for reaching out about a potential partnership with Sylvia!! I'm happy to share her media kit https://taboost.my.canva.site/sylvia + rates below:</w:t>
+        <w:t>Thank you so much for reaching out about a potential partnership with Sylvia!! I’m happy to share her media kit HERE [https://taboost.my.canva.site/sylvia] + rates below:</w:t>
       </w:r>
     </w:p>
     <w:p>
       <w:r>
-        <w:t>• 1 TikTok (beauty): $2,000</w:t>
+        <w:t>• 1 TikTok [https://www.tiktok.com/@sylviavanhoevenbeauty] (beauty): $2,000</w:t>
       </w:r>
     </w:p>
     <w:p>
       <w:r>
-        <w:t>• 1 TikTok (fashion): $1,000</w:t>
+        <w:t>• 1 TikTok [https://www.tiktok.com/@sylviavanhoeven] (fashion): $1,000</w:t>
       </w:r>
     </w:p>
     <w:p>
       <w:r>
-        <w:t>• 1 IG Reel: $850</w:t>
+        <w:t>• 1 IG Reel [https://www.instagram.com/sylviavanhoeven]: $850</w:t>
       </w:r>
     </w:p>
     <w:p>
@@ -276,7 +270,7 @@
     <w:p/>
     <w:p>
       <w:r>
-        <w:t>Please let us know what account you'd like her to post on in your offer + if you have any questions moving forward. We'd love to explore working together!</w:t>
+        <w:t>Please let us know what account you'd like her to post on in your offer + if you have any questions moving forward. We’d love to explore working together!</w:t>
       </w:r>
     </w:p>
     <w:p>
@@ -323,7 +317,7 @@
     </w:p>
     <w:p>
       <w:r>
-        <w:t>Sylvia's standard rate is $2,000 per video! https://taboost.my.canva.site/sylvia is her media kit. Below is her bundle pricing:</w:t>
+        <w:t>Sylvia's standard rate is $2,000 per video! HERE [https://taboost.my.canva.site/sylvia] is her media kit. Below is her bundle pricing:</w:t>
       </w:r>
     </w:p>
     <w:p/>
@@ -345,7 +339,7 @@
     <w:p/>
     <w:p>
       <w:r>
-        <w:t>We've found bundles usually perform better since multiple posts make the product feel like a real part of her routine instead of a one-off. Let me know your thoughts!</w:t>
+        <w:t>We’ve found bundles usually perform better since multiple posts make the product feel like a real part of her routine instead of a one-off. Let me know your thoughts!</w:t>
       </w:r>
     </w:p>
     <w:p>
@@ -400,13 +394,18 @@
     </w:p>
     <w:p>
       <w:r>
+        <w:t>Email Draft: CC cara@taboost.me</w:t>
+      </w:r>
+    </w:p>
+    <w:p>
+      <w:r>
         <w:t>Hi,</w:t>
       </w:r>
     </w:p>
     <w:p/>
     <w:p>
       <w:r>
-        <w:t>Thank you for the offer! I think this collab could be a good fit for Sylvia. Looping in her management team who can move forward with this convo!</w:t>
+        <w:t>Thank you for the offer! I think this collab could be a good fit for Sylvia [https://www.tiktok.com/@sylviavanhoevenbeauty]. Looping in her management team who can move forward with this convo!</w:t>
       </w:r>
     </w:p>
     <w:p>
@@ -422,17 +421,231 @@
         <w:rPr>
           <w:b/>
         </w:rPr>
-        <w:t>⏳ SOP PENDING — AI will NOT draft. All emails routed to Human Admin Required.</w:t>
+        <w:t>✅ SOP APPROVED — AI may draft for this talent</w:t>
       </w:r>
     </w:p>
     <w:p>
       <w:r>
-        <w:t>Manager: Chenni  |  Minimum Rate: $2000 per video</w:t>
+        <w:t>Manager: Chenni Li (chenni@taboost.me)  |  Minimum Rate: $2000 per video</w:t>
       </w:r>
     </w:p>
     <w:p>
-      <w:r>
-        <w:t>(Add approved scenarios below when ready.)</w:t>
+      <w:pPr>
+        <w:pStyle w:val="Heading2"/>
+      </w:pPr>
+      <w:r>
+        <w:t>Scenario A: Initial Inbound (Default Response) — DEFAULT RESPONSE</w:t>
+      </w:r>
+    </w:p>
+    <w:p>
+      <w:r>
+        <w:rPr>
+          <w:b/>
+        </w:rPr>
+        <w:t>Use when:</w:t>
+      </w:r>
+    </w:p>
+    <w:p>
+      <w:r>
+        <w:t>• Asking for rates or a potential to collab</w:t>
+      </w:r>
+    </w:p>
+    <w:p>
+      <w:r>
+        <w:t>• All other general inquiries</w:t>
+      </w:r>
+    </w:p>
+    <w:p>
+      <w:r>
+        <w:rPr>
+          <w:b/>
+        </w:rPr>
+        <w:t>Do not use when:</w:t>
+      </w:r>
+    </w:p>
+    <w:p>
+      <w:r>
+        <w:t>• An exact match from scenario below</w:t>
+      </w:r>
+    </w:p>
+    <w:p>
+      <w:r>
+        <w:rPr>
+          <w:b/>
+        </w:rPr>
+        <w:t>Approved Response:</w:t>
+      </w:r>
+    </w:p>
+    <w:p>
+      <w:r>
+        <w:t>Thank you so much for reaching out about a potential partnership with Trinity!! I’m happy to share her media kit HERE [https://taboost.my.canva.site/trinity] + rates below:</w:t>
+      </w:r>
+    </w:p>
+    <w:p>
+      <w:r>
+        <w:t>• 1 TikTok [https://www.tiktok.com/@trinity.blair]: $4,000</w:t>
+      </w:r>
+    </w:p>
+    <w:p>
+      <w:r>
+        <w:t>• 1 IG Reel [https://www.instagram.com/trinyxo]: $2,000</w:t>
+      </w:r>
+    </w:p>
+    <w:p>
+      <w:r>
+        <w:t>• Podcast [https://open.spotify.com/show/5j2Sagld5jGiJibHlXUohQ?si=330cd6a1acc54cbf] Feature: $1,500</w:t>
+      </w:r>
+    </w:p>
+    <w:p>
+      <w:r>
+        <w:t>• 1 UGC Video: $1,500 (usage to be negotiated)</w:t>
+      </w:r>
+    </w:p>
+    <w:p/>
+    <w:p>
+      <w:r>
+        <w:t>Trinity's pricing reflects her 3.4M followers + high engagement rate. She has a cult following always asking her for suggestions, recommendations, and advice via TikTok, her Podcast, Snapchat, and IG!!</w:t>
+      </w:r>
+    </w:p>
+    <w:p/>
+    <w:p>
+      <w:r>
+        <w:t>Please let us know what type of collab you're looking for in your offer + if you have any questions moving forward. We’d love to explore working together!</w:t>
+      </w:r>
+    </w:p>
+    <w:p>
+      <w:pPr>
+        <w:pStyle w:val="Heading2"/>
+      </w:pPr>
+      <w:r>
+        <w:t>Scenario B: Initial Inbound (Bundle Rate Requested)</w:t>
+      </w:r>
+    </w:p>
+    <w:p>
+      <w:r>
+        <w:rPr>
+          <w:b/>
+        </w:rPr>
+        <w:t>Use when:</w:t>
+      </w:r>
+    </w:p>
+    <w:p>
+      <w:r>
+        <w:t>• Asking for bundle rates</w:t>
+      </w:r>
+    </w:p>
+    <w:p>
+      <w:r>
+        <w:rPr>
+          <w:b/>
+        </w:rPr>
+        <w:t>Do not use when:</w:t>
+      </w:r>
+    </w:p>
+    <w:p>
+      <w:r>
+        <w:t>• Multiple post rate is not asked for</w:t>
+      </w:r>
+    </w:p>
+    <w:p>
+      <w:r>
+        <w:rPr>
+          <w:b/>
+        </w:rPr>
+        <w:t>Approved Response:</w:t>
+      </w:r>
+    </w:p>
+    <w:p>
+      <w:r>
+        <w:t>Trinity's standard rate is $4,000 per video! HERE [https://taboost.my.canva.site/trinity] is her media kit. Below is her bundle pricing:</w:t>
+      </w:r>
+    </w:p>
+    <w:p/>
+    <w:p>
+      <w:r>
+        <w:t>3 videos (85%) → $10,000</w:t>
+      </w:r>
+    </w:p>
+    <w:p>
+      <w:r>
+        <w:t>5 videos (80%) → $16,000</w:t>
+      </w:r>
+    </w:p>
+    <w:p>
+      <w:r>
+        <w:t>10 videos (70%) → $28,000</w:t>
+      </w:r>
+    </w:p>
+    <w:p/>
+    <w:p>
+      <w:r>
+        <w:t>We’ve found bundles usually perform better since multiple posts make the product feel like a real part of her routine instead of a one-off. Let me know your thoughts!</w:t>
+      </w:r>
+    </w:p>
+    <w:p>
+      <w:pPr>
+        <w:pStyle w:val="Heading2"/>
+      </w:pPr>
+      <w:r>
+        <w:t>Scenario C: Initial Inbound (Adequate Offer)</w:t>
+      </w:r>
+    </w:p>
+    <w:p>
+      <w:r>
+        <w:rPr>
+          <w:b/>
+        </w:rPr>
+        <w:t>Use when:</w:t>
+      </w:r>
+    </w:p>
+    <w:p>
+      <w:r>
+        <w:t>• Initially offered a rate that is OVER $600 for one post</w:t>
+      </w:r>
+    </w:p>
+    <w:p>
+      <w:r>
+        <w:rPr>
+          <w:b/>
+        </w:rPr>
+        <w:t>Do not use when:</w:t>
+      </w:r>
+    </w:p>
+    <w:p>
+      <w:r>
+        <w:t>• An explicit offer of the above rate is not specified</w:t>
+      </w:r>
+    </w:p>
+    <w:p>
+      <w:r>
+        <w:rPr>
+          <w:b/>
+        </w:rPr>
+        <w:t>CC: chenni@taboost.me</w:t>
+      </w:r>
+    </w:p>
+    <w:p>
+      <w:r>
+        <w:rPr>
+          <w:b/>
+        </w:rPr>
+        <w:t>Approved Response:</w:t>
+      </w:r>
+    </w:p>
+    <w:p>
+      <w:r>
+        <w:t>Email Draft: CC chenni@taboost.me</w:t>
+      </w:r>
+    </w:p>
+    <w:p>
+      <w:r>
+        <w:t>Hi,</w:t>
+      </w:r>
+    </w:p>
+    <w:p/>
+    <w:p>
+      <w:r>
+        <w:t>Thank you for the offer! I think this collab could be a good fit for Trinity [https://www.tiktok.com/@trinity.blair]. Looping in her management team who can move forward with this convo!</w:t>
       </w:r>
     </w:p>
     <w:p>
@@ -492,7 +705,7 @@
     </w:p>
     <w:p>
       <w:r>
-        <w:t>• An exact match from a more specific scenario below</w:t>
+        <w:t>• An exact match from scenario below</w:t>
       </w:r>
     </w:p>
     <w:p>
@@ -505,22 +718,22 @@
     </w:p>
     <w:p>
       <w:r>
-        <w:t>Thank you so much for reaching out about a potential partnership with Sam!! I'm happy to share her rates below:</w:t>
+        <w:t>Thank you so much for reaching out about a potential partnership with Sam!! I’m happy to share her rates below:</w:t>
       </w:r>
     </w:p>
     <w:p>
       <w:r>
-        <w:t>• 1 TikTok: $900</w:t>
+        <w:t>• 1 TikTok [https://www.tiktok.com/@sam_joness_]: $900</w:t>
       </w:r>
     </w:p>
     <w:p>
       <w:r>
-        <w:t>• 1 IG Reel: $600</w:t>
+        <w:t>• 1 IG Reel [https://www.instagram.com/its_samjones_/reels/]: $600</w:t>
       </w:r>
     </w:p>
     <w:p>
       <w:r>
-        <w:t>• 1 UGC Video: $1,500 (usage can be added on for an additional cost)</w:t>
+        <w:t>• 1 UGC Video [https://samjonesugc.my.canva.site/]: $1,500 (usage can be added on for an additional cost)</w:t>
       </w:r>
     </w:p>
     <w:p/>
@@ -532,7 +745,7 @@
     <w:p/>
     <w:p>
       <w:r>
-        <w:t>Please let us know what type of collab you're looking for in your offer + if you have any questions moving forward. We'd love to explore working together!</w:t>
+        <w:t>Please let us know what type of collab you're looking for in your offer + if you have any questions moving forward. We’d love to explore working together!</w:t>
       </w:r>
     </w:p>
     <w:p>
@@ -601,7 +814,7 @@
     <w:p/>
     <w:p>
       <w:r>
-        <w:t>We've found bundles usually perform better since multiple posts make the product feel like a real part of her routine instead of a one-off. Let me know your thoughts!</w:t>
+        <w:t>We’ve found bundles usually perform better since multiple posts make the product feel like a real part of her routine instead of a one-off. Let me know your thoughts!</w:t>
       </w:r>
     </w:p>
     <w:p>
@@ -656,13 +869,18 @@
     </w:p>
     <w:p>
       <w:r>
+        <w:t>Email Draft: CC cara@taboost.me</w:t>
+      </w:r>
+    </w:p>
+    <w:p>
+      <w:r>
         <w:t>Hi,</w:t>
       </w:r>
     </w:p>
     <w:p/>
     <w:p>
       <w:r>
-        <w:t>Thank you for the offer! I think this collab could be a good fit for Sam. Looping her in management team who can move forward with this convo!</w:t>
+        <w:t>Thank you for the offer! I think this collab could be a good fit for Sam [https://www.tiktok.com/@sam_joness_]. Looping in her management team who can move forward with this convo!</w:t>
       </w:r>
     </w:p>
     <w:p>
@@ -774,7 +992,7 @@
     </w:p>
     <w:p>
       <w:r>
-        <w:t>• An exact match from a more specific scenario below</w:t>
+        <w:t>• An exact match from scenario below</w:t>
       </w:r>
     </w:p>
     <w:p>
@@ -787,12 +1005,12 @@
     </w:p>
     <w:p>
       <w:r>
-        <w:t>Thank you so much for reaching out about a potential partnership with Lizz!! I'm happy to share her rates below:</w:t>
+        <w:t>Thank you so much for reaching out about a potential partnership with Lizz!! I’m happy to share her rates below:</w:t>
       </w:r>
     </w:p>
     <w:p>
       <w:r>
-        <w:t>• 1 TikTok: $750</w:t>
+        <w:t>• 1 TikTok [https://www.tiktok.com/@lizzmi45]: $750</w:t>
       </w:r>
     </w:p>
     <w:p>
@@ -809,7 +1027,7 @@
     <w:p/>
     <w:p>
       <w:r>
-        <w:t>Please let us know what type of collab you're looking for in your offer + if you have any questions moving forward. We'd love to explore working together!</w:t>
+        <w:t>Please let us know what type of collab you're looking for in your offer + if you have any questions moving forward. We’d love to explore working together!</w:t>
       </w:r>
     </w:p>
     <w:p>
@@ -856,7 +1074,7 @@
     </w:p>
     <w:p>
       <w:r>
-        <w:t>Lizz's standard rate is $750 per video! Below is her bundle pricing:</w:t>
+        <w:t>Lizz's [https://www.tiktok.com/@lizzmi45] standard rate is $750 per video! Below is her bundle pricing:</w:t>
       </w:r>
     </w:p>
     <w:p/>
@@ -878,7 +1096,7 @@
     <w:p/>
     <w:p>
       <w:r>
-        <w:t>We've found bundles usually perform better since multiple posts make the product feel like a real part of her routine instead of a one-off. Let me know your thoughts!</w:t>
+        <w:t>We’ve found bundles usually perform better since multiple posts make the product feel like a real part of her routine instead of a one-off. Let me know your thoughts!</w:t>
       </w:r>
     </w:p>
     <w:p>
@@ -933,13 +1151,18 @@
     </w:p>
     <w:p>
       <w:r>
+        <w:t>Email Draft: CC chenni@taboost.me</w:t>
+      </w:r>
+    </w:p>
+    <w:p>
+      <w:r>
         <w:t>Hi,</w:t>
       </w:r>
     </w:p>
     <w:p/>
     <w:p>
       <w:r>
-        <w:t>Thank you for the offer! I think this collab could be a good fit for Lizz. Looping her in management team who can move forward with this convo!</w:t>
+        <w:t>Thank you for the offer! I think this collab could be a good fit for Lizz [https://www.tiktok.com/@lizzmi45]. Looping in her management team who can move forward with this convo!</w:t>
       </w:r>
     </w:p>
     <w:p>
@@ -999,7 +1222,7 @@
     </w:p>
     <w:p>
       <w:r>
-        <w:t>• An exact match from a more specific scenario below</w:t>
+        <w:t>• An exact match from scenario below</w:t>
       </w:r>
     </w:p>
     <w:p>
@@ -1012,17 +1235,17 @@
     </w:p>
     <w:p>
       <w:r>
-        <w:t>Thank you so much for reaching out about a potential partnership with Katrina!! I'm happy to share her rates below:</w:t>
+        <w:t>Thank you so much for reaching out about a potential partnership with Katrina!! I’m happy to share her rates below:</w:t>
       </w:r>
     </w:p>
     <w:p>
       <w:r>
-        <w:t>• 1 TikTok: $500</w:t>
+        <w:t>• 1 TikTok [https://www.tiktok.com/@katrinagmoore]: $500</w:t>
       </w:r>
     </w:p>
     <w:p>
       <w:r>
-        <w:t>• Cross posting to IG Reels: + $150</w:t>
+        <w:t>• Cross posting to IG Reels [https://www.instagram.com/katrinamoore621/reels/]: + $150</w:t>
       </w:r>
     </w:p>
     <w:p>
@@ -1039,7 +1262,7 @@
     <w:p/>
     <w:p>
       <w:r>
-        <w:t>Please let us know what type of collab you're looking for in your offer + if you have any questions moving forward. We'd love to explore working together!</w:t>
+        <w:t>Please let us know what type of collab you're looking for in your offer + if you have any questions moving forward. We’d love to explore working together!</w:t>
       </w:r>
     </w:p>
     <w:p>
@@ -1086,7 +1309,7 @@
     </w:p>
     <w:p>
       <w:r>
-        <w:t>Katrina's standard rate is $500 per video! Below is her bundle pricing:</w:t>
+        <w:t>Katrina's [https://www.tiktok.com/@katrinagmoore] standard rate is $500 per video! Below is her bundle pricing:</w:t>
       </w:r>
     </w:p>
     <w:p/>
@@ -1108,7 +1331,7 @@
     <w:p/>
     <w:p>
       <w:r>
-        <w:t>We've found bundles usually perform better since multiple posts make the product feel like a real part of her routine instead of a one-off. Let me know your thoughts!</w:t>
+        <w:t>We’ve found bundles usually perform better since multiple posts make the product feel like a real part of her routine instead of a one-off. Let me know your thoughts!</w:t>
       </w:r>
     </w:p>
     <w:p>
@@ -1163,13 +1386,18 @@
     </w:p>
     <w:p>
       <w:r>
+        <w:t>Email Draft: CC chenni@taboost.me</w:t>
+      </w:r>
+    </w:p>
+    <w:p>
+      <w:r>
         <w:t>Hi,</w:t>
       </w:r>
     </w:p>
     <w:p/>
     <w:p>
       <w:r>
-        <w:t>Thank you for the offer! I think this collab could be a good fit for Katrina. Looping her in management team who can move forward with this convo!</w:t>
+        <w:t>Thank you for the offer! I think this collab could be a good fit for Katrina [https://www.tiktok.com/@katrinagmoore]. Looping in her management team who can move forward with this convo!</w:t>
       </w:r>
     </w:p>
     <w:p>

</xml_diff>